<commit_message>
docs: reframe workshop around local Brainstem
Co-authored-by: Copilot <223556219+Copilot@users.noreply.github.com>
</commit_message>
<xml_diff>
--- a/docs/rapp-workshop/downloads/FY27 RAPP Customer Communications Pack.docx
+++ b/docs/rapp-workshop/downloads/FY27 RAPP Customer Communications Pack.docx
@@ -79,7 +79,7 @@
           <w:sz w:val="24"/>
           <w:szCs w:val="24"/>
         </w:rPr>
-        <w:t xml:space="preserve">Documents → Copilot Studio</w:t>
+        <w:t xml:space="preserve">Use case → Local Brainstem agent</w:t>
       </w:r>
     </w:p>
     <w:tbl>
@@ -764,7 +764,7 @@
                 <w:sz w:val="21"/>
                 <w:szCs w:val="21"/>
               </w:rPr>
-              <w:t xml:space="preserve">Confirm accounts, environment, safe files, and success measure.</w:t>
+              <w:t xml:space="preserve">Confirm GitHub Copilot, local Brainstem, safe files, and success measure.</w:t>
             </w:r>
           </w:p>
         </w:tc>
@@ -1595,7 +1595,7 @@
           <w:sz w:val="21"/>
           <w:szCs w:val="21"/>
         </w:rPr>
-        <w:t xml:space="preserve">We are preparing a 60-minute RAPP workshop that turns one approved source document into a reviewable Copilot Studio prototype. Participants will learn the process by doing: sign in, upload documents, confirm an MVP, review generated assets, deploy to a workshop environment, and test.</w:t>
+        <w:t xml:space="preserve">We are preparing a 60-minute RAPP workshop that turns one approved source into a working local Brainstem agent. Participants will authenticate with GitHub Copilot, start Brainstem, author one agent.py, run and refine it locally, and share the file.</w:t>
       </w:r>
     </w:p>
     <w:p>
@@ -1638,7 +1638,7 @@
           <w:sz w:val="21"/>
           <w:szCs w:val="21"/>
         </w:rPr>
-        <w:t xml:space="preserve">One business scenario owner who can approve the MVP.</w:t>
+        <w:t xml:space="preserve">One business scenario owner who can approve the agent contract.</w:t>
       </w:r>
     </w:p>
     <w:p>
@@ -1684,7 +1684,7 @@
           <w:sz w:val="21"/>
           <w:szCs w:val="21"/>
         </w:rPr>
-        <w:t xml:space="preserve">One technical contact who can confirm Copilot Studio and Dataverse access.</w:t>
+        <w:t xml:space="preserve">One technical contact who can confirm GitHub Copilot/local-machine readiness and any optional Copilot Studio access.</w:t>
       </w:r>
     </w:p>
     <w:p>
@@ -1724,7 +1724,7 @@
           <w:sz w:val="21"/>
           <w:szCs w:val="21"/>
         </w:rPr>
-        <w:t xml:space="preserve">Important data notice: do not provide secrets, credentials, or information you are not authorized to process with Azure OpenAI. We will confirm the final source set with you before the workshop.</w:t>
+        <w:t xml:space="preserve">Important data notice: do not provide secrets, credentials, or information you are not authorized to process with GitHub Copilot. We will confirm the final source set with you before the workshop.</w:t>
       </w:r>
     </w:p>
     <w:p>
@@ -3355,7 +3355,7 @@
                 <w:sz w:val="21"/>
                 <w:szCs w:val="21"/>
               </w:rPr>
-              <w:t xml:space="preserve">Will attendees have Copilot Studio maker access?</w:t>
+              <w:t xml:space="preserve">Will attendees have a GitHub account with Copilot access?</w:t>
             </w:r>
           </w:p>
         </w:tc>
@@ -3516,7 +3516,329 @@
                 <w:sz w:val="21"/>
                 <w:szCs w:val="21"/>
               </w:rPr>
-              <w:t xml:space="preserve">Who can approve the MVP and next step?</w:t>
+              <w:t xml:space="preserve">Optional: do attendees have Copilot Studio maker/deployment access?</w:t>
+            </w:r>
+          </w:p>
+        </w:tc>
+        <w:tc>
+          <w:tcPr>
+            <w:tcW w:type="dxa" w:w="1600"/>
+            <w:tcBorders>
+              <w:top w:val="single" w:color="D2D0CE" w:sz="1"/>
+              <w:left w:val="single" w:color="D2D0CE" w:sz="1"/>
+              <w:bottom w:val="single" w:color="D2D0CE" w:sz="1"/>
+              <w:right w:val="single" w:color="D2D0CE" w:sz="1"/>
+            </w:tcBorders>
+            <w:shd w:fill="F3F2F1" w:val="clear"/>
+            <w:tcMar>
+              <w:top w:type="dxa" w:w="90"/>
+              <w:left w:type="dxa" w:w="120"/>
+              <w:bottom w:type="dxa" w:w="90"/>
+              <w:right w:type="dxa" w:w="120"/>
+            </w:tcMar>
+            <w:vAlign w:val="center"/>
+          </w:tcPr>
+          <w:p>
+            <w:pPr>
+              <w:keepNext w:val="false"/>
+              <w:spacing w:after="40" w:before="0" w:line="276"/>
+              <w:jc w:val="left"/>
+            </w:pPr>
+            <w:r>
+              <w:rPr>
+                <w:rFonts w:ascii="Segoe UI" w:cs="Segoe UI" w:eastAsia="Segoe UI" w:hAnsi="Segoe UI"/>
+                <w:b w:val="false"/>
+                <w:bCs w:val="false"/>
+                <w:i w:val="false"/>
+                <w:iCs w:val="false"/>
+                <w:color w:val="1B1A19"/>
+                <w:sz w:val="21"/>
+                <w:szCs w:val="21"/>
+              </w:rPr>
+              <w:t xml:space="preserve">Choice</w:t>
+            </w:r>
+          </w:p>
+        </w:tc>
+        <w:tc>
+          <w:tcPr>
+            <w:tcW w:type="dxa" w:w="2610"/>
+            <w:tcBorders>
+              <w:top w:val="single" w:color="D2D0CE" w:sz="1"/>
+              <w:left w:val="single" w:color="D2D0CE" w:sz="1"/>
+              <w:bottom w:val="single" w:color="D2D0CE" w:sz="1"/>
+              <w:right w:val="single" w:color="D2D0CE" w:sz="1"/>
+            </w:tcBorders>
+            <w:shd w:fill="F3F2F1" w:val="clear"/>
+            <w:tcMar>
+              <w:top w:type="dxa" w:w="90"/>
+              <w:left w:type="dxa" w:w="120"/>
+              <w:bottom w:type="dxa" w:w="90"/>
+              <w:right w:type="dxa" w:w="120"/>
+            </w:tcMar>
+            <w:vAlign w:val="center"/>
+          </w:tcPr>
+          <w:p>
+            <w:pPr>
+              <w:keepNext w:val="false"/>
+              <w:spacing w:after="40" w:before="0" w:line="276"/>
+              <w:jc w:val="left"/>
+            </w:pPr>
+            <w:r>
+              <w:rPr>
+                <w:rFonts w:ascii="Segoe UI" w:cs="Segoe UI" w:eastAsia="Segoe UI" w:hAnsi="Segoe UI"/>
+                <w:b w:val="false"/>
+                <w:bCs w:val="false"/>
+                <w:i w:val="false"/>
+                <w:iCs w:val="false"/>
+                <w:color w:val="1B1A19"/>
+                <w:sz w:val="21"/>
+                <w:szCs w:val="21"/>
+              </w:rPr>
+              <w:t xml:space="preserve">Yes / no / unsure</w:t>
+            </w:r>
+          </w:p>
+        </w:tc>
+      </w:tr>
+      <w:tr>
+        <w:trPr>
+          <w:cantSplit/>
+        </w:trPr>
+        <w:tc>
+          <w:tcPr>
+            <w:tcW w:type="dxa" w:w="450"/>
+            <w:tcBorders>
+              <w:top w:val="single" w:color="D2D0CE" w:sz="1"/>
+              <w:left w:val="single" w:color="D2D0CE" w:sz="1"/>
+              <w:bottom w:val="single" w:color="D2D0CE" w:sz="1"/>
+              <w:right w:val="single" w:color="D2D0CE" w:sz="1"/>
+            </w:tcBorders>
+            <w:shd w:fill="FFFFFF" w:val="clear"/>
+            <w:tcMar>
+              <w:top w:type="dxa" w:w="90"/>
+              <w:left w:type="dxa" w:w="120"/>
+              <w:bottom w:type="dxa" w:w="90"/>
+              <w:right w:type="dxa" w:w="120"/>
+            </w:tcMar>
+            <w:vAlign w:val="center"/>
+          </w:tcPr>
+          <w:p>
+            <w:pPr>
+              <w:keepNext w:val="false"/>
+              <w:spacing w:after="40" w:before="0" w:line="276"/>
+              <w:jc w:val="left"/>
+            </w:pPr>
+            <w:r>
+              <w:rPr>
+                <w:rFonts w:ascii="Segoe UI" w:cs="Segoe UI" w:eastAsia="Segoe UI" w:hAnsi="Segoe UI"/>
+                <w:b w:val="false"/>
+                <w:bCs w:val="false"/>
+                <w:i w:val="false"/>
+                <w:iCs w:val="false"/>
+                <w:color w:val="1B1A19"/>
+                <w:sz w:val="21"/>
+                <w:szCs w:val="21"/>
+              </w:rPr>
+              <w:t xml:space="preserve">11</w:t>
+            </w:r>
+          </w:p>
+        </w:tc>
+        <w:tc>
+          <w:tcPr>
+            <w:tcW w:type="dxa" w:w="4700"/>
+            <w:tcBorders>
+              <w:top w:val="single" w:color="D2D0CE" w:sz="1"/>
+              <w:left w:val="single" w:color="D2D0CE" w:sz="1"/>
+              <w:bottom w:val="single" w:color="D2D0CE" w:sz="1"/>
+              <w:right w:val="single" w:color="D2D0CE" w:sz="1"/>
+            </w:tcBorders>
+            <w:shd w:fill="FFFFFF" w:val="clear"/>
+            <w:tcMar>
+              <w:top w:type="dxa" w:w="90"/>
+              <w:left w:type="dxa" w:w="120"/>
+              <w:bottom w:type="dxa" w:w="90"/>
+              <w:right w:type="dxa" w:w="120"/>
+            </w:tcMar>
+            <w:vAlign w:val="center"/>
+          </w:tcPr>
+          <w:p>
+            <w:pPr>
+              <w:keepNext w:val="false"/>
+              <w:spacing w:after="40" w:before="0" w:line="276"/>
+              <w:jc w:val="left"/>
+            </w:pPr>
+            <w:r>
+              <w:rPr>
+                <w:rFonts w:ascii="Segoe UI" w:cs="Segoe UI" w:eastAsia="Segoe UI" w:hAnsi="Segoe UI"/>
+                <w:b w:val="false"/>
+                <w:bCs w:val="false"/>
+                <w:i w:val="false"/>
+                <w:iCs w:val="false"/>
+                <w:color w:val="1B1A19"/>
+                <w:sz w:val="21"/>
+                <w:szCs w:val="21"/>
+              </w:rPr>
+              <w:t xml:space="preserve">Is a customer Evaluation Harness repo or GitHub Actions pipeline already planned?</w:t>
+            </w:r>
+          </w:p>
+        </w:tc>
+        <w:tc>
+          <w:tcPr>
+            <w:tcW w:type="dxa" w:w="1600"/>
+            <w:tcBorders>
+              <w:top w:val="single" w:color="D2D0CE" w:sz="1"/>
+              <w:left w:val="single" w:color="D2D0CE" w:sz="1"/>
+              <w:bottom w:val="single" w:color="D2D0CE" w:sz="1"/>
+              <w:right w:val="single" w:color="D2D0CE" w:sz="1"/>
+            </w:tcBorders>
+            <w:shd w:fill="FFFFFF" w:val="clear"/>
+            <w:tcMar>
+              <w:top w:type="dxa" w:w="90"/>
+              <w:left w:type="dxa" w:w="120"/>
+              <w:bottom w:type="dxa" w:w="90"/>
+              <w:right w:type="dxa" w:w="120"/>
+            </w:tcMar>
+            <w:vAlign w:val="center"/>
+          </w:tcPr>
+          <w:p>
+            <w:pPr>
+              <w:keepNext w:val="false"/>
+              <w:spacing w:after="40" w:before="0" w:line="276"/>
+              <w:jc w:val="left"/>
+            </w:pPr>
+            <w:r>
+              <w:rPr>
+                <w:rFonts w:ascii="Segoe UI" w:cs="Segoe UI" w:eastAsia="Segoe UI" w:hAnsi="Segoe UI"/>
+                <w:b w:val="false"/>
+                <w:bCs w:val="false"/>
+                <w:i w:val="false"/>
+                <w:iCs w:val="false"/>
+                <w:color w:val="1B1A19"/>
+                <w:sz w:val="21"/>
+                <w:szCs w:val="21"/>
+              </w:rPr>
+              <w:t xml:space="preserve">Short text</w:t>
+            </w:r>
+          </w:p>
+        </w:tc>
+        <w:tc>
+          <w:tcPr>
+            <w:tcW w:type="dxa" w:w="2610"/>
+            <w:tcBorders>
+              <w:top w:val="single" w:color="D2D0CE" w:sz="1"/>
+              <w:left w:val="single" w:color="D2D0CE" w:sz="1"/>
+              <w:bottom w:val="single" w:color="D2D0CE" w:sz="1"/>
+              <w:right w:val="single" w:color="D2D0CE" w:sz="1"/>
+            </w:tcBorders>
+            <w:shd w:fill="FFFFFF" w:val="clear"/>
+            <w:tcMar>
+              <w:top w:type="dxa" w:w="90"/>
+              <w:left w:type="dxa" w:w="120"/>
+              <w:bottom w:type="dxa" w:w="90"/>
+              <w:right w:type="dxa" w:w="120"/>
+            </w:tcMar>
+            <w:vAlign w:val="center"/>
+          </w:tcPr>
+          <w:p>
+            <w:pPr>
+              <w:keepNext w:val="false"/>
+              <w:spacing w:after="40" w:before="0" w:line="276"/>
+              <w:jc w:val="left"/>
+            </w:pPr>
+            <w:r>
+              <w:rPr>
+                <w:rFonts w:ascii="Segoe UI" w:cs="Segoe UI" w:eastAsia="Segoe UI" w:hAnsi="Segoe UI"/>
+                <w:b w:val="false"/>
+                <w:bCs w:val="false"/>
+                <w:i w:val="false"/>
+                <w:iCs w:val="false"/>
+                <w:color w:val="1B1A19"/>
+                <w:sz w:val="21"/>
+                <w:szCs w:val="21"/>
+              </w:rPr>
+              <w:t xml:space="preserve">Repo/owner/status; avoid duplicate work</w:t>
+            </w:r>
+          </w:p>
+        </w:tc>
+      </w:tr>
+      <w:tr>
+        <w:trPr>
+          <w:cantSplit/>
+        </w:trPr>
+        <w:tc>
+          <w:tcPr>
+            <w:tcW w:type="dxa" w:w="450"/>
+            <w:tcBorders>
+              <w:top w:val="single" w:color="D2D0CE" w:sz="1"/>
+              <w:left w:val="single" w:color="D2D0CE" w:sz="1"/>
+              <w:bottom w:val="single" w:color="D2D0CE" w:sz="1"/>
+              <w:right w:val="single" w:color="D2D0CE" w:sz="1"/>
+            </w:tcBorders>
+            <w:shd w:fill="F3F2F1" w:val="clear"/>
+            <w:tcMar>
+              <w:top w:type="dxa" w:w="90"/>
+              <w:left w:type="dxa" w:w="120"/>
+              <w:bottom w:type="dxa" w:w="90"/>
+              <w:right w:type="dxa" w:w="120"/>
+            </w:tcMar>
+            <w:vAlign w:val="center"/>
+          </w:tcPr>
+          <w:p>
+            <w:pPr>
+              <w:keepNext w:val="false"/>
+              <w:spacing w:after="40" w:before="0" w:line="276"/>
+              <w:jc w:val="left"/>
+            </w:pPr>
+            <w:r>
+              <w:rPr>
+                <w:rFonts w:ascii="Segoe UI" w:cs="Segoe UI" w:eastAsia="Segoe UI" w:hAnsi="Segoe UI"/>
+                <w:b w:val="false"/>
+                <w:bCs w:val="false"/>
+                <w:i w:val="false"/>
+                <w:iCs w:val="false"/>
+                <w:color w:val="1B1A19"/>
+                <w:sz w:val="21"/>
+                <w:szCs w:val="21"/>
+              </w:rPr>
+              <w:t xml:space="preserve">12</w:t>
+            </w:r>
+          </w:p>
+        </w:tc>
+        <w:tc>
+          <w:tcPr>
+            <w:tcW w:type="dxa" w:w="4700"/>
+            <w:tcBorders>
+              <w:top w:val="single" w:color="D2D0CE" w:sz="1"/>
+              <w:left w:val="single" w:color="D2D0CE" w:sz="1"/>
+              <w:bottom w:val="single" w:color="D2D0CE" w:sz="1"/>
+              <w:right w:val="single" w:color="D2D0CE" w:sz="1"/>
+            </w:tcBorders>
+            <w:shd w:fill="F3F2F1" w:val="clear"/>
+            <w:tcMar>
+              <w:top w:type="dxa" w:w="90"/>
+              <w:left w:type="dxa" w:w="120"/>
+              <w:bottom w:type="dxa" w:w="90"/>
+              <w:right w:type="dxa" w:w="120"/>
+            </w:tcMar>
+            <w:vAlign w:val="center"/>
+          </w:tcPr>
+          <w:p>
+            <w:pPr>
+              <w:keepNext w:val="false"/>
+              <w:spacing w:after="40" w:before="0" w:line="276"/>
+              <w:jc w:val="left"/>
+            </w:pPr>
+            <w:r>
+              <w:rPr>
+                <w:rFonts w:ascii="Segoe UI" w:cs="Segoe UI" w:eastAsia="Segoe UI" w:hAnsi="Segoe UI"/>
+                <w:b w:val="false"/>
+                <w:bCs w:val="false"/>
+                <w:i w:val="false"/>
+                <w:iCs w:val="false"/>
+                <w:color w:val="1B1A19"/>
+                <w:sz w:val="21"/>
+                <w:szCs w:val="21"/>
+              </w:rPr>
+              <w:t xml:space="preserve">Who can approve the agent contract and next step?</w:t>
             </w:r>
           </w:p>
         </w:tc>
@@ -3975,7 +4297,7 @@
           <w:sz w:val="21"/>
           <w:szCs w:val="21"/>
         </w:rPr>
-        <w:t xml:space="preserve">Open {WORKSHOP_URL} and confirm you can sign in with your Microsoft account.</w:t>
+        <w:t xml:space="preserve">Run gh auth login (or complete Brainstem device-code sign-in) and confirm GitHub Copilot access.</w:t>
       </w:r>
     </w:p>
     <w:p>
@@ -3998,7 +4320,7 @@
           <w:sz w:val="21"/>
           <w:szCs w:val="21"/>
         </w:rPr>
-        <w:t xml:space="preserve">Open Copilot Studio and confirm {TARGET_ENVIRONMENT} is visible.</w:t>
+        <w:t xml:space="preserve">Run the installer, start brainstem, and open http://localhost:7071.</w:t>
       </w:r>
     </w:p>
     <w:p>
@@ -4061,7 +4383,7 @@
           <w:sz w:val="21"/>
           <w:szCs w:val="21"/>
         </w:rPr>
-        <w:t xml:space="preserve">The workshop uploader supports PDF, DOCX, PPTX, XLSX, TXT, MD, CSV, JSON, RTF, HTML, and agent source/ZIP files. Image-only notes should be OCR'd or placed into a readable PDF/DOCX before the session.</w:t>
+        <w:t xml:space="preserve">Use a readable transcript, requirements document, or notes as authoring context. Image-only notes should be OCR'd or transcribed before the session.</w:t>
       </w:r>
     </w:p>
     <w:p>
@@ -4321,7 +4643,7 @@
           <w:sz w:val="21"/>
           <w:szCs w:val="21"/>
         </w:rPr>
-        <w:t xml:space="preserve">Tomorrow we will turn the approved {SCENARIO_TITLE} source set into a Copilot Studio prototype in 60 minutes.</w:t>
+        <w:t xml:space="preserve">Tomorrow we will turn the approved {SCENARIO_TITLE} source into a working local Brainstem agent in 60 minutes.</w:t>
       </w:r>
     </w:p>
     <w:p>
@@ -4387,7 +4709,7 @@
           <w:sz w:val="21"/>
           <w:szCs w:val="21"/>
         </w:rPr>
-        <w:t xml:space="preserve">Sign in at {WORKSHOP_URL}.</w:t>
+        <w:t xml:space="preserve">Confirm GitHub Copilot authentication.</w:t>
       </w:r>
     </w:p>
     <w:p>
@@ -4410,7 +4732,7 @@
           <w:sz w:val="21"/>
           <w:szCs w:val="21"/>
         </w:rPr>
-        <w:t xml:space="preserve">Open {TARGET_ENVIRONMENT} in Copilot Studio.</w:t>
+        <w:t xml:space="preserve">Run brainstem and open http://localhost:7071.</w:t>
       </w:r>
     </w:p>
     <w:p>
@@ -4456,7 +4778,7 @@
           <w:sz w:val="21"/>
           <w:szCs w:val="21"/>
         </w:rPr>
-        <w:t xml:space="preserve">Challenge the MVP and test the resulting agent.</w:t>
+        <w:t xml:space="preserve">Challenge the agent contract and test the local behavior.</w:t>
       </w:r>
     </w:p>
     <w:p>
@@ -4630,7 +4952,7 @@
                 <w:sz w:val="21"/>
                 <w:szCs w:val="21"/>
               </w:rPr>
-              <w:t xml:space="preserve">Welcome to the FY27 RAPP workshop. Open {WORKSHOP_URL}, sign in, and keep {TARGET_ENVIRONMENT} available in Copilot Studio. We will work in driver/navigator pairs. Use the chat for access issues; never post credentials or secrets.</w:t>
+              <w:t xml:space="preserve">Welcome to the FY27 RAPP workshop. Open the install link, confirm GitHub Copilot authentication, start brainstem, and open http://localhost:7071. We will work in driver/navigator pairs. The optional extension agent will be shared here near the end; never post credentials or secrets.</w:t>
             </w:r>
           </w:p>
         </w:tc>
@@ -4851,7 +5173,7 @@
           <w:sz w:val="21"/>
           <w:szCs w:val="21"/>
         </w:rPr>
-        <w:t xml:space="preserve">Together we converted {SOURCE_SUMMARY} into the confirmed MVP "{MVP_TITLE}", generated {CAPABILITY_COUNT} capability agent(s), imported {SOLUTION_NAME} into {TARGET_ENVIRONMENT}, and tested the prototype.</w:t>
+        <w:t xml:space="preserve">Together we converted {SOURCE_SUMMARY} into a shareable local agent.py, hot-loaded it in Brainstem, and captured test evidence. Optional extension outputs, if used, include a local M365-style HTML demo and solution ZIP.</w:t>
       </w:r>
     </w:p>
     <w:p>
@@ -5314,7 +5636,7 @@
                 <w:sz w:val="21"/>
                 <w:szCs w:val="21"/>
               </w:rPr>
-              <w:t xml:space="preserve">The MVP gate improved confidence in what was built.</w:t>
+              <w:t xml:space="preserve">The agent-contract gate improved confidence in what was built.</w:t>
             </w:r>
           </w:p>
         </w:tc>
@@ -5436,7 +5758,7 @@
                 <w:sz w:val="21"/>
                 <w:szCs w:val="21"/>
               </w:rPr>
-              <w:t xml:space="preserve">I understand the difference between the demo twin and live prototype.</w:t>
+              <w:t xml:space="preserve">I can import, run, edit, and share a local agent.py.</w:t>
             </w:r>
           </w:p>
         </w:tc>
@@ -6368,7 +6690,7 @@
                 <w:sz w:val="21"/>
                 <w:szCs w:val="21"/>
               </w:rPr>
-              <w:t xml:space="preserve">Confirmed MVP</w:t>
+              <w:t xml:space="preserve">Agent contract</w:t>
             </w:r>
           </w:p>
         </w:tc>
@@ -6407,7 +6729,7 @@
                 <w:sz w:val="21"/>
                 <w:szCs w:val="21"/>
               </w:rPr>
-              <w:t xml:space="preserve">{MVP title and statement}</w:t>
+              <w:t xml:space="preserve">{Filename, purpose, parameters, expected output}</w:t>
             </w:r>
           </w:p>
         </w:tc>
@@ -6573,7 +6895,7 @@
                 <w:sz w:val="21"/>
                 <w:szCs w:val="21"/>
               </w:rPr>
-              <w:t xml:space="preserve">{Live ZIP, demo ZIP, agent files, demo driver, test case}</w:t>
+              <w:t xml:space="preserve">{agent.py, local responses/logs, test prompts/scores, optional HTML/ZIP}</w:t>
             </w:r>
           </w:p>
         </w:tc>
@@ -6617,7 +6939,7 @@
                 <w:sz w:val="21"/>
                 <w:szCs w:val="21"/>
               </w:rPr>
-              <w:t xml:space="preserve">Deployment status</w:t>
+              <w:t xml:space="preserve">Optional extension status</w:t>
             </w:r>
           </w:p>
         </w:tc>
@@ -6656,7 +6978,7 @@
                 <w:sz w:val="21"/>
                 <w:szCs w:val="21"/>
               </w:rPr>
-              <w:t xml:space="preserve">{Environment, imported/published, connection status}</w:t>
+              <w:t xml:space="preserve">{Not used / local HTML+ZIP / connected deployment}</w:t>
             </w:r>
           </w:p>
         </w:tc>
@@ -6700,7 +7022,7 @@
                 <w:sz w:val="21"/>
                 <w:szCs w:val="21"/>
               </w:rPr>
-              <w:t xml:space="preserve">Test evidence</w:t>
+              <w:t xml:space="preserve">Test &amp; Eval handoff</w:t>
             </w:r>
           </w:p>
         </w:tc>
@@ -6739,7 +7061,7 @@
                 <w:sz w:val="21"/>
                 <w:szCs w:val="21"/>
               </w:rPr>
-              <w:t xml:space="preserve">{Prompts, expected vs actual, pass/fail/mixed}</w:t>
+              <w:t xml:space="preserve">{Existing repo/pipeline owner; seed test assets supplied; no duplicate pipeline work}</w:t>
             </w:r>
           </w:p>
         </w:tc>
@@ -6783,7 +7105,7 @@
                 <w:sz w:val="21"/>
                 <w:szCs w:val="21"/>
               </w:rPr>
-              <w:t xml:space="preserve">Known gaps</w:t>
+              <w:t xml:space="preserve">Test evidence</w:t>
             </w:r>
           </w:p>
         </w:tc>
@@ -6822,7 +7144,7 @@
                 <w:sz w:val="21"/>
                 <w:szCs w:val="21"/>
               </w:rPr>
-              <w:t xml:space="preserve">{Top three gaps only}</w:t>
+              <w:t xml:space="preserve">{Prompts, expected vs actual, pass/fail/mixed}</w:t>
             </w:r>
           </w:p>
         </w:tc>
@@ -6866,7 +7188,7 @@
                 <w:sz w:val="21"/>
                 <w:szCs w:val="21"/>
               </w:rPr>
-              <w:t xml:space="preserve">Recommendation</w:t>
+              <w:t xml:space="preserve">Known gaps</w:t>
             </w:r>
           </w:p>
         </w:tc>
@@ -6905,7 +7227,7 @@
                 <w:sz w:val="21"/>
                 <w:szCs w:val="21"/>
               </w:rPr>
-              <w:t xml:space="preserve">{Iterate / scale / stop}</w:t>
+              <w:t xml:space="preserve">{Top three gaps only}</w:t>
             </w:r>
           </w:p>
         </w:tc>
@@ -6949,6 +7271,89 @@
                 <w:sz w:val="21"/>
                 <w:szCs w:val="21"/>
               </w:rPr>
+              <w:t xml:space="preserve">Recommendation</w:t>
+            </w:r>
+          </w:p>
+        </w:tc>
+        <w:tc>
+          <w:tcPr>
+            <w:tcW w:type="dxa" w:w="6860"/>
+            <w:tcBorders>
+              <w:top w:val="single" w:color="D2D0CE" w:sz="1"/>
+              <w:left w:val="single" w:color="D2D0CE" w:sz="1"/>
+              <w:bottom w:val="single" w:color="D2D0CE" w:sz="1"/>
+              <w:right w:val="single" w:color="D2D0CE" w:sz="1"/>
+            </w:tcBorders>
+            <w:shd w:fill="FFFFFF" w:val="clear"/>
+            <w:tcMar>
+              <w:top w:type="dxa" w:w="90"/>
+              <w:left w:type="dxa" w:w="120"/>
+              <w:bottom w:type="dxa" w:w="90"/>
+              <w:right w:type="dxa" w:w="120"/>
+            </w:tcMar>
+            <w:vAlign w:val="center"/>
+          </w:tcPr>
+          <w:p>
+            <w:pPr>
+              <w:keepNext w:val="false"/>
+              <w:spacing w:after="40" w:before="0" w:line="276"/>
+              <w:jc w:val="left"/>
+            </w:pPr>
+            <w:r>
+              <w:rPr>
+                <w:rFonts w:ascii="Segoe UI" w:cs="Segoe UI" w:eastAsia="Segoe UI" w:hAnsi="Segoe UI"/>
+                <w:b w:val="false"/>
+                <w:bCs w:val="false"/>
+                <w:i w:val="false"/>
+                <w:iCs w:val="false"/>
+                <w:color w:val="1B1A19"/>
+                <w:sz w:val="21"/>
+                <w:szCs w:val="21"/>
+              </w:rPr>
+              <w:t xml:space="preserve">{Iterate / scale / stop}</w:t>
+            </w:r>
+          </w:p>
+        </w:tc>
+      </w:tr>
+      <w:tr>
+        <w:trPr>
+          <w:cantSplit/>
+        </w:trPr>
+        <w:tc>
+          <w:tcPr>
+            <w:tcW w:type="dxa" w:w="2500"/>
+            <w:tcBorders>
+              <w:top w:val="single" w:color="D2D0CE" w:sz="1"/>
+              <w:left w:val="single" w:color="D2D0CE" w:sz="1"/>
+              <w:bottom w:val="single" w:color="D2D0CE" w:sz="1"/>
+              <w:right w:val="single" w:color="D2D0CE" w:sz="1"/>
+            </w:tcBorders>
+            <w:shd w:fill="F3F2F1" w:val="clear"/>
+            <w:tcMar>
+              <w:top w:type="dxa" w:w="90"/>
+              <w:left w:type="dxa" w:w="120"/>
+              <w:bottom w:type="dxa" w:w="90"/>
+              <w:right w:type="dxa" w:w="120"/>
+            </w:tcMar>
+            <w:vAlign w:val="center"/>
+          </w:tcPr>
+          <w:p>
+            <w:pPr>
+              <w:keepNext w:val="false"/>
+              <w:spacing w:after="40" w:before="0" w:line="276"/>
+              <w:jc w:val="left"/>
+            </w:pPr>
+            <w:r>
+              <w:rPr>
+                <w:rFonts w:ascii="Segoe UI" w:cs="Segoe UI" w:eastAsia="Segoe UI" w:hAnsi="Segoe UI"/>
+                <w:b w:val="false"/>
+                <w:bCs w:val="false"/>
+                <w:i w:val="false"/>
+                <w:iCs w:val="false"/>
+                <w:color w:val="1B1A19"/>
+                <w:sz w:val="21"/>
+                <w:szCs w:val="21"/>
+              </w:rPr>
               <w:t xml:space="preserve">Decision owner and date</w:t>
             </w:r>
           </w:p>
@@ -6962,7 +7367,7 @@
               <w:bottom w:val="single" w:color="D2D0CE" w:sz="1"/>
               <w:right w:val="single" w:color="D2D0CE" w:sz="1"/>
             </w:tcBorders>
-            <w:shd w:fill="FFFFFF" w:val="clear"/>
+            <w:shd w:fill="F3F2F1" w:val="clear"/>
             <w:tcMar>
               <w:top w:type="dxa" w:w="90"/>
               <w:left w:type="dxa" w:w="120"/>

</xml_diff>